<commit_message>
feat(director): add materials valuation overview and official report generator, remove completion rate
</commit_message>
<xml_diff>
--- a/public/templates/FGMU Job Request Form.docx
+++ b/public/templates/FGMU Job Request Form.docx
@@ -30,12 +30,12 @@
         <w:tblLook w:val="04A0" w:firstRow="1" w:lastRow="0" w:firstColumn="1" w:lastColumn="0" w:noHBand="0" w:noVBand="1"/>
       </w:tblPr>
       <w:tblGrid>
-        <w:gridCol w:w="1479"/>
-        <w:gridCol w:w="1318"/>
-        <w:gridCol w:w="1058"/>
-        <w:gridCol w:w="1664"/>
-        <w:gridCol w:w="2535"/>
-        <w:gridCol w:w="2629"/>
+        <w:gridCol w:w="1421"/>
+        <w:gridCol w:w="1238"/>
+        <w:gridCol w:w="1129"/>
+        <w:gridCol w:w="1618"/>
+        <w:gridCol w:w="2566"/>
+        <w:gridCol w:w="2711"/>
       </w:tblGrid>
       <w:tr>
         <w:trPr>
@@ -812,7 +812,7 @@
                 </mc:Choice>
                 <mc:Fallback>
                   <w:pict>
-                    <v:rect w14:anchorId="3B8F1904" id="Rectangle 38" o:spid="_x0000_s1026" style="position:absolute;margin-left:.5pt;margin-top:1.6pt;width:14.4pt;height:8.7pt;z-index:251653120;visibility:visible;mso-wrap-style:square;mso-width-percent:0;mso-height-percent:0;mso-wrap-distance-left:9pt;mso-wrap-distance-top:0;mso-wrap-distance-right:9pt;mso-wrap-distance-bottom:0;mso-position-horizontal:absolute;mso-position-horizontal-relative:text;mso-position-vertical:absolute;mso-position-vertical-relative:text;mso-width-percent:0;mso-height-percent:0;mso-width-relative:margin;mso-height-relative:margin;v-text-anchor:middle" o:gfxdata="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" filled="f" strokecolor="black [3213]" strokeweight="1pt"/>
+                    <v:rect w14:anchorId="7B1D7CF3" id="Rectangle 38" o:spid="_x0000_s1026" style="position:absolute;margin-left:.5pt;margin-top:1.6pt;width:14.4pt;height:8.7pt;z-index:251653120;visibility:visible;mso-wrap-style:square;mso-width-percent:0;mso-height-percent:0;mso-wrap-distance-left:9pt;mso-wrap-distance-top:0;mso-wrap-distance-right:9pt;mso-wrap-distance-bottom:0;mso-position-horizontal:absolute;mso-position-horizontal-relative:text;mso-position-vertical:absolute;mso-position-vertical-relative:text;mso-width-percent:0;mso-height-percent:0;mso-width-relative:margin;mso-height-relative:margin;v-text-anchor:middle" o:gfxdata="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" filled="f" strokecolor="black [3213]" strokeweight="1pt"/>
                   </w:pict>
                 </mc:Fallback>
               </mc:AlternateContent>
@@ -919,7 +919,7 @@
                 </mc:Choice>
                 <mc:Fallback>
                   <w:pict>
-                    <v:rect w14:anchorId="4A740647" id="Rectangle 40" o:spid="_x0000_s1026" style="position:absolute;margin-left:.4pt;margin-top:1.1pt;width:14.4pt;height:8.7pt;z-index:251654144;visibility:visible;mso-wrap-style:square;mso-width-percent:0;mso-height-percent:0;mso-wrap-distance-left:9pt;mso-wrap-distance-top:0;mso-wrap-distance-right:9pt;mso-wrap-distance-bottom:0;mso-position-horizontal:absolute;mso-position-horizontal-relative:text;mso-position-vertical:absolute;mso-position-vertical-relative:text;mso-width-percent:0;mso-height-percent:0;mso-width-relative:margin;mso-height-relative:margin;v-text-anchor:middle" o:gfxdata="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" filled="f" strokecolor="black [3213]" strokeweight="1pt"/>
+                    <v:rect w14:anchorId="33E15EBF" id="Rectangle 40" o:spid="_x0000_s1026" style="position:absolute;margin-left:.4pt;margin-top:1.1pt;width:14.4pt;height:8.7pt;z-index:251654144;visibility:visible;mso-wrap-style:square;mso-width-percent:0;mso-height-percent:0;mso-wrap-distance-left:9pt;mso-wrap-distance-top:0;mso-wrap-distance-right:9pt;mso-wrap-distance-bottom:0;mso-position-horizontal:absolute;mso-position-horizontal-relative:text;mso-position-vertical:absolute;mso-position-vertical-relative:text;mso-width-percent:0;mso-height-percent:0;mso-width-relative:margin;mso-height-relative:margin;v-text-anchor:middle" o:gfxdata="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" filled="f" strokecolor="black [3213]" strokeweight="1pt"/>
                   </w:pict>
                 </mc:Fallback>
               </mc:AlternateContent>
@@ -1036,7 +1036,7 @@
                 </mc:Choice>
                 <mc:Fallback>
                   <w:pict>
-                    <v:rect w14:anchorId="50C0D21E" id="Rectangle 41" o:spid="_x0000_s1026" style="position:absolute;margin-left:.4pt;margin-top:.65pt;width:14.4pt;height:8.7pt;z-index:251655168;visibility:visible;mso-wrap-style:square;mso-width-percent:0;mso-height-percent:0;mso-wrap-distance-left:9pt;mso-wrap-distance-top:0;mso-wrap-distance-right:9pt;mso-wrap-distance-bottom:0;mso-position-horizontal:absolute;mso-position-horizontal-relative:text;mso-position-vertical:absolute;mso-position-vertical-relative:text;mso-width-percent:0;mso-height-percent:0;mso-width-relative:margin;mso-height-relative:margin;v-text-anchor:middle" o:gfxdata="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" filled="f" strokecolor="black [3213]" strokeweight="1pt"/>
+                    <v:rect w14:anchorId="463CC835" id="Rectangle 41" o:spid="_x0000_s1026" style="position:absolute;margin-left:.4pt;margin-top:.65pt;width:14.4pt;height:8.7pt;z-index:251655168;visibility:visible;mso-wrap-style:square;mso-width-percent:0;mso-height-percent:0;mso-wrap-distance-left:9pt;mso-wrap-distance-top:0;mso-wrap-distance-right:9pt;mso-wrap-distance-bottom:0;mso-position-horizontal:absolute;mso-position-horizontal-relative:text;mso-position-vertical:absolute;mso-position-vertical-relative:text;mso-width-percent:0;mso-height-percent:0;mso-width-relative:margin;mso-height-relative:margin;v-text-anchor:middle" o:gfxdata="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" filled="f" strokecolor="black [3213]" strokeweight="1pt"/>
                   </w:pict>
                 </mc:Fallback>
               </mc:AlternateContent>
@@ -1145,7 +1145,7 @@
                 </mc:Choice>
                 <mc:Fallback>
                   <w:pict>
-                    <v:rect w14:anchorId="7B0B9920" id="Rectangle 42" o:spid="_x0000_s1026" style="position:absolute;margin-left:.25pt;margin-top:1pt;width:14.4pt;height:8.7pt;z-index:251656192;visibility:visible;mso-wrap-style:square;mso-width-percent:0;mso-height-percent:0;mso-wrap-distance-left:9pt;mso-wrap-distance-top:0;mso-wrap-distance-right:9pt;mso-wrap-distance-bottom:0;mso-position-horizontal:absolute;mso-position-horizontal-relative:text;mso-position-vertical:absolute;mso-position-vertical-relative:text;mso-width-percent:0;mso-height-percent:0;mso-width-relative:margin;mso-height-relative:margin;v-text-anchor:middle" o:gfxdata="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" filled="f" strokecolor="black [3213]" strokeweight="1pt"/>
+                    <v:rect w14:anchorId="642DC73D" id="Rectangle 42" o:spid="_x0000_s1026" style="position:absolute;margin-left:.25pt;margin-top:1pt;width:14.4pt;height:8.7pt;z-index:251656192;visibility:visible;mso-wrap-style:square;mso-width-percent:0;mso-height-percent:0;mso-wrap-distance-left:9pt;mso-wrap-distance-top:0;mso-wrap-distance-right:9pt;mso-wrap-distance-bottom:0;mso-position-horizontal:absolute;mso-position-horizontal-relative:text;mso-position-vertical:absolute;mso-position-vertical-relative:text;mso-width-percent:0;mso-height-percent:0;mso-width-relative:margin;mso-height-relative:margin;v-text-anchor:middle" o:gfxdata="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" filled="f" strokecolor="black [3213]" strokeweight="1pt"/>
                   </w:pict>
                 </mc:Fallback>
               </mc:AlternateContent>
@@ -1254,7 +1254,7 @@
                 </mc:Choice>
                 <mc:Fallback>
                   <w:pict>
-                    <v:rect w14:anchorId="6A619B8D" id="Rectangle 43" o:spid="_x0000_s1026" style="position:absolute;margin-left:0;margin-top:1.55pt;width:14.4pt;height:8.7pt;z-index:251657216;visibility:visible;mso-wrap-style:square;mso-width-percent:0;mso-height-percent:0;mso-wrap-distance-left:9pt;mso-wrap-distance-top:0;mso-wrap-distance-right:9pt;mso-wrap-distance-bottom:0;mso-position-horizontal:absolute;mso-position-horizontal-relative:text;mso-position-vertical:absolute;mso-position-vertical-relative:text;mso-width-percent:0;mso-height-percent:0;mso-width-relative:margin;mso-height-relative:margin;v-text-anchor:middle" o:gfxdata="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" filled="f" strokecolor="black [3213]" strokeweight="1pt"/>
+                    <v:rect w14:anchorId="4DC26F0D" id="Rectangle 43" o:spid="_x0000_s1026" style="position:absolute;margin-left:0;margin-top:1.55pt;width:14.4pt;height:8.7pt;z-index:251657216;visibility:visible;mso-wrap-style:square;mso-width-percent:0;mso-height-percent:0;mso-wrap-distance-left:9pt;mso-wrap-distance-top:0;mso-wrap-distance-right:9pt;mso-wrap-distance-bottom:0;mso-position-horizontal:absolute;mso-position-horizontal-relative:text;mso-position-vertical:absolute;mso-position-vertical-relative:text;mso-width-percent:0;mso-height-percent:0;mso-width-relative:margin;mso-height-relative:margin;v-text-anchor:middle" o:gfxdata="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" filled="f" strokecolor="black [3213]" strokeweight="1pt"/>
                   </w:pict>
                 </mc:Fallback>
               </mc:AlternateContent>
@@ -1363,7 +1363,7 @@
                 </mc:Choice>
                 <mc:Fallback>
                   <w:pict>
-                    <v:rect w14:anchorId="659D09B5" id="Rectangle 3" o:spid="_x0000_s1026" style="position:absolute;margin-left:.2pt;margin-top:1.85pt;width:14.4pt;height:8.75pt;z-index:251661312;visibility:visible;mso-wrap-style:square;mso-width-percent:0;mso-height-percent:0;mso-wrap-distance-left:9pt;mso-wrap-distance-top:0;mso-wrap-distance-right:9pt;mso-wrap-distance-bottom:0;mso-position-horizontal:absolute;mso-position-horizontal-relative:text;mso-position-vertical:absolute;mso-position-vertical-relative:text;mso-width-percent:0;mso-height-percent:0;mso-width-relative:margin;mso-height-relative:margin;v-text-anchor:middle" o:gfxdata="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" filled="f" strokecolor="black [3213]" strokeweight="1pt"/>
+                    <v:rect w14:anchorId="667EB2E2" id="Rectangle 3" o:spid="_x0000_s1026" style="position:absolute;margin-left:.2pt;margin-top:1.85pt;width:14.4pt;height:8.75pt;z-index:251661312;visibility:visible;mso-wrap-style:square;mso-width-percent:0;mso-height-percent:0;mso-wrap-distance-left:9pt;mso-wrap-distance-top:0;mso-wrap-distance-right:9pt;mso-wrap-distance-bottom:0;mso-position-horizontal:absolute;mso-position-horizontal-relative:text;mso-position-vertical:absolute;mso-position-vertical-relative:text;mso-width-percent:0;mso-height-percent:0;mso-width-relative:margin;mso-height-relative:margin;v-text-anchor:middle" o:gfxdata="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" filled="f" strokecolor="black [3213]" strokeweight="1pt"/>
                   </w:pict>
                 </mc:Fallback>
               </mc:AlternateContent>
@@ -1486,7 +1486,7 @@
                 </mc:Choice>
                 <mc:Fallback>
                   <w:pict>
-                    <v:rect w14:anchorId="20F98337" id="Rectangle 45" o:spid="_x0000_s1026" style="position:absolute;margin-left:0;margin-top:.95pt;width:14.4pt;height:8.7pt;z-index:251659264;visibility:visible;mso-wrap-style:square;mso-width-percent:0;mso-height-percent:0;mso-wrap-distance-left:9pt;mso-wrap-distance-top:0;mso-wrap-distance-right:9pt;mso-wrap-distance-bottom:0;mso-position-horizontal:absolute;mso-position-horizontal-relative:text;mso-position-vertical:absolute;mso-position-vertical-relative:text;mso-width-percent:0;mso-height-percent:0;mso-width-relative:margin;mso-height-relative:margin;v-text-anchor:middle" o:gfxdata="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" filled="f" strokecolor="black [3213]" strokeweight="1pt"/>
+                    <v:rect w14:anchorId="6F1279A6" id="Rectangle 45" o:spid="_x0000_s1026" style="position:absolute;margin-left:0;margin-top:.95pt;width:14.4pt;height:8.7pt;z-index:251659264;visibility:visible;mso-wrap-style:square;mso-width-percent:0;mso-height-percent:0;mso-wrap-distance-left:9pt;mso-wrap-distance-top:0;mso-wrap-distance-right:9pt;mso-wrap-distance-bottom:0;mso-position-horizontal:absolute;mso-position-horizontal-relative:text;mso-position-vertical:absolute;mso-position-vertical-relative:text;mso-width-percent:0;mso-height-percent:0;mso-width-relative:margin;mso-height-relative:margin;v-text-anchor:middle" o:gfxdata="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" filled="f" strokecolor="black [3213]" strokeweight="1pt"/>
                   </w:pict>
                 </mc:Fallback>
               </mc:AlternateContent>
@@ -1594,7 +1594,7 @@
                 </mc:Choice>
                 <mc:Fallback>
                   <w:pict>
-                    <v:rect w14:anchorId="1D9AFB9E" id="Rectangle 19" o:spid="_x0000_s1026" style="position:absolute;margin-left:.2pt;margin-top:1.1pt;width:14.4pt;height:8.7pt;z-index:251645952;visibility:visible;mso-wrap-style:square;mso-width-percent:0;mso-height-percent:0;mso-wrap-distance-left:9pt;mso-wrap-distance-top:0;mso-wrap-distance-right:9pt;mso-wrap-distance-bottom:0;mso-position-horizontal:absolute;mso-position-horizontal-relative:text;mso-position-vertical:absolute;mso-position-vertical-relative:text;mso-width-percent:0;mso-height-percent:0;mso-width-relative:margin;mso-height-relative:margin;v-text-anchor:middle" o:gfxdata="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" filled="f" strokecolor="black [3213]" strokeweight="1pt"/>
+                    <v:rect w14:anchorId="53DF524C" id="Rectangle 19" o:spid="_x0000_s1026" style="position:absolute;margin-left:.2pt;margin-top:1.1pt;width:14.4pt;height:8.7pt;z-index:251645952;visibility:visible;mso-wrap-style:square;mso-width-percent:0;mso-height-percent:0;mso-wrap-distance-left:9pt;mso-wrap-distance-top:0;mso-wrap-distance-right:9pt;mso-wrap-distance-bottom:0;mso-position-horizontal:absolute;mso-position-horizontal-relative:text;mso-position-vertical:absolute;mso-position-vertical-relative:text;mso-width-percent:0;mso-height-percent:0;mso-width-relative:margin;mso-height-relative:margin;v-text-anchor:middle" o:gfxdata="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" filled="f" strokecolor="black [3213]" strokeweight="1pt"/>
                   </w:pict>
                 </mc:Fallback>
               </mc:AlternateContent>
@@ -1695,7 +1695,7 @@
                 </mc:Choice>
                 <mc:Fallback>
                   <w:pict>
-                    <v:rect w14:anchorId="66EB6CD9" id="Rectangle 21" o:spid="_x0000_s1026" style="position:absolute;margin-left:.15pt;margin-top:1.1pt;width:14.4pt;height:8.7pt;z-index:251646976;visibility:visible;mso-wrap-style:square;mso-width-percent:0;mso-height-percent:0;mso-wrap-distance-left:9pt;mso-wrap-distance-top:0;mso-wrap-distance-right:9pt;mso-wrap-distance-bottom:0;mso-position-horizontal:absolute;mso-position-horizontal-relative:text;mso-position-vertical:absolute;mso-position-vertical-relative:text;mso-width-percent:0;mso-height-percent:0;mso-width-relative:margin;mso-height-relative:margin;v-text-anchor:middle" o:gfxdata="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" filled="f" strokecolor="black [3213]" strokeweight="1pt"/>
+                    <v:rect w14:anchorId="07E5E34D" id="Rectangle 21" o:spid="_x0000_s1026" style="position:absolute;margin-left:.15pt;margin-top:1.1pt;width:14.4pt;height:8.7pt;z-index:251646976;visibility:visible;mso-wrap-style:square;mso-width-percent:0;mso-height-percent:0;mso-wrap-distance-left:9pt;mso-wrap-distance-top:0;mso-wrap-distance-right:9pt;mso-wrap-distance-bottom:0;mso-position-horizontal:absolute;mso-position-horizontal-relative:text;mso-position-vertical:absolute;mso-position-vertical-relative:text;mso-width-percent:0;mso-height-percent:0;mso-width-relative:margin;mso-height-relative:margin;v-text-anchor:middle" o:gfxdata="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" filled="f" strokecolor="black [3213]" strokeweight="1pt"/>
                   </w:pict>
                 </mc:Fallback>
               </mc:AlternateContent>
@@ -1796,7 +1796,7 @@
                 </mc:Choice>
                 <mc:Fallback>
                   <w:pict>
-                    <v:rect w14:anchorId="009D2809" id="Rectangle 22" o:spid="_x0000_s1026" style="position:absolute;margin-left:.15pt;margin-top:1.35pt;width:14.4pt;height:8.7pt;z-index:251648000;visibility:visible;mso-wrap-style:square;mso-width-percent:0;mso-height-percent:0;mso-wrap-distance-left:9pt;mso-wrap-distance-top:0;mso-wrap-distance-right:9pt;mso-wrap-distance-bottom:0;mso-position-horizontal:absolute;mso-position-horizontal-relative:text;mso-position-vertical:absolute;mso-position-vertical-relative:text;mso-width-percent:0;mso-height-percent:0;mso-width-relative:margin;mso-height-relative:margin;v-text-anchor:middle" o:gfxdata="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" filled="f" strokecolor="black [3213]" strokeweight="1pt"/>
+                    <v:rect w14:anchorId="45563452" id="Rectangle 22" o:spid="_x0000_s1026" style="position:absolute;margin-left:.15pt;margin-top:1.35pt;width:14.4pt;height:8.7pt;z-index:251648000;visibility:visible;mso-wrap-style:square;mso-width-percent:0;mso-height-percent:0;mso-wrap-distance-left:9pt;mso-wrap-distance-top:0;mso-wrap-distance-right:9pt;mso-wrap-distance-bottom:0;mso-position-horizontal:absolute;mso-position-horizontal-relative:text;mso-position-vertical:absolute;mso-position-vertical-relative:text;mso-width-percent:0;mso-height-percent:0;mso-width-relative:margin;mso-height-relative:margin;v-text-anchor:middle" o:gfxdata="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" filled="f" strokecolor="black [3213]" strokeweight="1pt"/>
                   </w:pict>
                 </mc:Fallback>
               </mc:AlternateContent>
@@ -1930,7 +1930,7 @@
                 </mc:Choice>
                 <mc:Fallback>
                   <w:pict>
-                    <v:rect w14:anchorId="241DCD9C" id="Rectangle 23" o:spid="_x0000_s1026" style="position:absolute;margin-left:-.2pt;margin-top:1.5pt;width:14.4pt;height:8.7pt;z-index:251649024;visibility:visible;mso-wrap-style:square;mso-width-percent:0;mso-height-percent:0;mso-wrap-distance-left:9pt;mso-wrap-distance-top:0;mso-wrap-distance-right:9pt;mso-wrap-distance-bottom:0;mso-position-horizontal:absolute;mso-position-horizontal-relative:text;mso-position-vertical:absolute;mso-position-vertical-relative:text;mso-width-percent:0;mso-height-percent:0;mso-width-relative:margin;mso-height-relative:margin;v-text-anchor:middle" o:gfxdata="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" filled="f" strokecolor="black [3213]" strokeweight="1pt"/>
+                    <v:rect w14:anchorId="3DC40260" id="Rectangle 23" o:spid="_x0000_s1026" style="position:absolute;margin-left:-.2pt;margin-top:1.5pt;width:14.4pt;height:8.7pt;z-index:251649024;visibility:visible;mso-wrap-style:square;mso-width-percent:0;mso-height-percent:0;mso-wrap-distance-left:9pt;mso-wrap-distance-top:0;mso-wrap-distance-right:9pt;mso-wrap-distance-bottom:0;mso-position-horizontal:absolute;mso-position-horizontal-relative:text;mso-position-vertical:absolute;mso-position-vertical-relative:text;mso-width-percent:0;mso-height-percent:0;mso-width-relative:margin;mso-height-relative:margin;v-text-anchor:middle" o:gfxdata="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" filled="f" strokecolor="black [3213]" strokeweight="1pt"/>
                   </w:pict>
                 </mc:Fallback>
               </mc:AlternateContent>
@@ -2031,7 +2031,7 @@
                 </mc:Choice>
                 <mc:Fallback>
                   <w:pict>
-                    <v:rect w14:anchorId="6F3443FE" id="Rectangle 25" o:spid="_x0000_s1026" style="position:absolute;margin-left:-.2pt;margin-top:1.25pt;width:14.4pt;height:8.7pt;z-index:251650048;visibility:visible;mso-wrap-style:square;mso-width-percent:0;mso-height-percent:0;mso-wrap-distance-left:9pt;mso-wrap-distance-top:0;mso-wrap-distance-right:9pt;mso-wrap-distance-bottom:0;mso-position-horizontal:absolute;mso-position-horizontal-relative:text;mso-position-vertical:absolute;mso-position-vertical-relative:text;mso-width-percent:0;mso-height-percent:0;mso-width-relative:margin;mso-height-relative:margin;v-text-anchor:middle" o:gfxdata="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" filled="f" strokecolor="black [3213]" strokeweight="1pt"/>
+                    <v:rect w14:anchorId="27215523" id="Rectangle 25" o:spid="_x0000_s1026" style="position:absolute;margin-left:-.2pt;margin-top:1.25pt;width:14.4pt;height:8.7pt;z-index:251650048;visibility:visible;mso-wrap-style:square;mso-width-percent:0;mso-height-percent:0;mso-wrap-distance-left:9pt;mso-wrap-distance-top:0;mso-wrap-distance-right:9pt;mso-wrap-distance-bottom:0;mso-position-horizontal:absolute;mso-position-horizontal-relative:text;mso-position-vertical:absolute;mso-position-vertical-relative:text;mso-width-percent:0;mso-height-percent:0;mso-width-relative:margin;mso-height-relative:margin;v-text-anchor:middle" o:gfxdata="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" filled="f" strokecolor="black [3213]" strokeweight="1pt"/>
                   </w:pict>
                 </mc:Fallback>
               </mc:AlternateContent>
@@ -2132,7 +2132,7 @@
                 </mc:Choice>
                 <mc:Fallback>
                   <w:pict>
-                    <v:rect w14:anchorId="3648F411" id="Rectangle 32" o:spid="_x0000_s1026" style="position:absolute;margin-left:-.4pt;margin-top:.9pt;width:14.4pt;height:8.7pt;z-index:251651072;visibility:visible;mso-wrap-style:square;mso-width-percent:0;mso-height-percent:0;mso-wrap-distance-left:9pt;mso-wrap-distance-top:0;mso-wrap-distance-right:9pt;mso-wrap-distance-bottom:0;mso-position-horizontal:absolute;mso-position-horizontal-relative:text;mso-position-vertical:absolute;mso-position-vertical-relative:text;mso-width-percent:0;mso-height-percent:0;mso-width-relative:margin;mso-height-relative:margin;v-text-anchor:middle" o:gfxdata="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" filled="f" strokecolor="black [3213]" strokeweight="1pt"/>
+                    <v:rect w14:anchorId="2AACED0C" id="Rectangle 32" o:spid="_x0000_s1026" style="position:absolute;margin-left:-.4pt;margin-top:.9pt;width:14.4pt;height:8.7pt;z-index:251651072;visibility:visible;mso-wrap-style:square;mso-width-percent:0;mso-height-percent:0;mso-wrap-distance-left:9pt;mso-wrap-distance-top:0;mso-wrap-distance-right:9pt;mso-wrap-distance-bottom:0;mso-position-horizontal:absolute;mso-position-horizontal-relative:text;mso-position-vertical:absolute;mso-position-vertical-relative:text;mso-width-percent:0;mso-height-percent:0;mso-width-relative:margin;mso-height-relative:margin;v-text-anchor:middle" o:gfxdata="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" filled="f" strokecolor="black [3213]" strokeweight="1pt"/>
                   </w:pict>
                 </mc:Fallback>
               </mc:AlternateContent>
@@ -2231,7 +2231,7 @@
                 </mc:Choice>
                 <mc:Fallback>
                   <w:pict>
-                    <v:rect w14:anchorId="731EA444" id="Rectangle 37" o:spid="_x0000_s1026" style="position:absolute;margin-left:-.6pt;margin-top:.4pt;width:14.4pt;height:8.7pt;z-index:251652096;visibility:visible;mso-wrap-style:square;mso-width-percent:0;mso-height-percent:0;mso-wrap-distance-left:9pt;mso-wrap-distance-top:0;mso-wrap-distance-right:9pt;mso-wrap-distance-bottom:0;mso-position-horizontal:absolute;mso-position-horizontal-relative:text;mso-position-vertical:absolute;mso-position-vertical-relative:text;mso-width-percent:0;mso-height-percent:0;mso-width-relative:margin;mso-height-relative:margin;v-text-anchor:middle" o:gfxdata="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" filled="f" strokecolor="black [3213]" strokeweight="1pt"/>
+                    <v:rect w14:anchorId="76362220" id="Rectangle 37" o:spid="_x0000_s1026" style="position:absolute;margin-left:-.6pt;margin-top:.4pt;width:14.4pt;height:8.7pt;z-index:251652096;visibility:visible;mso-wrap-style:square;mso-width-percent:0;mso-height-percent:0;mso-wrap-distance-left:9pt;mso-wrap-distance-top:0;mso-wrap-distance-right:9pt;mso-wrap-distance-bottom:0;mso-position-horizontal:absolute;mso-position-horizontal-relative:text;mso-position-vertical:absolute;mso-position-vertical-relative:text;mso-width-percent:0;mso-height-percent:0;mso-width-relative:margin;mso-height-relative:margin;v-text-anchor:middle" o:gfxdata="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" filled="f" strokecolor="black [3213]" strokeweight="1pt"/>
                   </w:pict>
                 </mc:Fallback>
               </mc:AlternateContent>
@@ -2338,7 +2338,7 @@
                 </mc:Choice>
                 <mc:Fallback>
                   <w:pict>
-                    <v:rect w14:anchorId="2A271D39" id="Rectangle 2" o:spid="_x0000_s1026" style="position:absolute;margin-left:-2.35pt;margin-top:1.6pt;width:16.35pt;height:8.7pt;z-index:251642880;visibility:visible;mso-wrap-style:square;mso-width-percent:0;mso-height-percent:0;mso-wrap-distance-left:9pt;mso-wrap-distance-top:0;mso-wrap-distance-right:9pt;mso-wrap-distance-bottom:0;mso-position-horizontal:absolute;mso-position-horizontal-relative:text;mso-position-vertical:absolute;mso-position-vertical-relative:text;mso-width-percent:0;mso-height-percent:0;mso-width-relative:margin;mso-height-relative:margin;v-text-anchor:middle" o:gfxdata="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" filled="f" strokecolor="black [3213]" strokeweight="1pt"/>
+                    <v:rect w14:anchorId="3BCF4CFB" id="Rectangle 2" o:spid="_x0000_s1026" style="position:absolute;margin-left:-2.35pt;margin-top:1.6pt;width:16.35pt;height:8.7pt;z-index:251642880;visibility:visible;mso-wrap-style:square;mso-width-percent:0;mso-height-percent:0;mso-wrap-distance-left:9pt;mso-wrap-distance-top:0;mso-wrap-distance-right:9pt;mso-wrap-distance-bottom:0;mso-position-horizontal:absolute;mso-position-horizontal-relative:text;mso-position-vertical:absolute;mso-position-vertical-relative:text;mso-width-percent:0;mso-height-percent:0;mso-width-relative:margin;mso-height-relative:margin;v-text-anchor:middle" o:gfxdata="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" filled="f" strokecolor="black [3213]" strokeweight="1pt"/>
                   </w:pict>
                 </mc:Fallback>
               </mc:AlternateContent>
@@ -2455,7 +2455,7 @@
                 </mc:Choice>
                 <mc:Fallback>
                   <w:pict>
-                    <v:rect w14:anchorId="333076FD" id="Rectangle 7" o:spid="_x0000_s1026" style="position:absolute;margin-left:-2.35pt;margin-top:1.65pt;width:16.35pt;height:8.7pt;z-index:251643904;visibility:visible;mso-wrap-style:square;mso-width-percent:0;mso-height-percent:0;mso-wrap-distance-left:9pt;mso-wrap-distance-top:0;mso-wrap-distance-right:9pt;mso-wrap-distance-bottom:0;mso-position-horizontal:absolute;mso-position-horizontal-relative:text;mso-position-vertical:absolute;mso-position-vertical-relative:text;mso-width-percent:0;mso-height-percent:0;mso-width-relative:margin;mso-height-relative:margin;v-text-anchor:middle" o:gfxdata="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" filled="f" strokecolor="black [3213]" strokeweight="1pt"/>
+                    <v:rect w14:anchorId="791BAB9D" id="Rectangle 7" o:spid="_x0000_s1026" style="position:absolute;margin-left:-2.35pt;margin-top:1.65pt;width:16.35pt;height:8.7pt;z-index:251643904;visibility:visible;mso-wrap-style:square;mso-width-percent:0;mso-height-percent:0;mso-wrap-distance-left:9pt;mso-wrap-distance-top:0;mso-wrap-distance-right:9pt;mso-wrap-distance-bottom:0;mso-position-horizontal:absolute;mso-position-horizontal-relative:text;mso-position-vertical:absolute;mso-position-vertical-relative:text;mso-width-percent:0;mso-height-percent:0;mso-width-relative:margin;mso-height-relative:margin;v-text-anchor:middle" o:gfxdata="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" filled="f" strokecolor="black [3213]" strokeweight="1pt"/>
                   </w:pict>
                 </mc:Fallback>
               </mc:AlternateContent>
@@ -2605,7 +2605,7 @@
                 </mc:Choice>
                 <mc:Fallback>
                   <w:pict>
-                    <v:rect w14:anchorId="782D99BF" id="Rectangle 9" o:spid="_x0000_s1026" style="position:absolute;margin-left:-2.6pt;margin-top:1.75pt;width:16.35pt;height:8.7pt;z-index:251644928;visibility:visible;mso-wrap-style:square;mso-width-percent:0;mso-height-percent:0;mso-wrap-distance-left:9pt;mso-wrap-distance-top:0;mso-wrap-distance-right:9pt;mso-wrap-distance-bottom:0;mso-position-horizontal:absolute;mso-position-horizontal-relative:text;mso-position-vertical:absolute;mso-position-vertical-relative:text;mso-width-percent:0;mso-height-percent:0;mso-width-relative:margin;mso-height-relative:margin;v-text-anchor:middle" o:gfxdata="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" filled="f" strokecolor="black [3213]" strokeweight="1pt"/>
+                    <v:rect w14:anchorId="0DA5CD1B" id="Rectangle 9" o:spid="_x0000_s1026" style="position:absolute;margin-left:-2.6pt;margin-top:1.75pt;width:16.35pt;height:8.7pt;z-index:251644928;visibility:visible;mso-wrap-style:square;mso-width-percent:0;mso-height-percent:0;mso-wrap-distance-left:9pt;mso-wrap-distance-top:0;mso-wrap-distance-right:9pt;mso-wrap-distance-bottom:0;mso-position-horizontal:absolute;mso-position-horizontal-relative:text;mso-position-vertical:absolute;mso-position-vertical-relative:text;mso-width-percent:0;mso-height-percent:0;mso-width-relative:margin;mso-height-relative:margin;v-text-anchor:middle" o:gfxdata="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" filled="f" strokecolor="black [3213]" strokeweight="1pt"/>
                   </w:pict>
                 </mc:Fallback>
               </mc:AlternateContent>
@@ -2730,7 +2730,7 @@
                 </mc:Choice>
                 <mc:Fallback>
                   <w:pict>
-                    <v:rect w14:anchorId="34BB15A3" id="Rectangle 1" o:spid="_x0000_s1026" style="position:absolute;margin-left:-2.6pt;margin-top:11.8pt;width:16.35pt;height:8.7pt;z-index:251660288;visibility:visible;mso-wrap-style:square;mso-width-percent:0;mso-height-percent:0;mso-wrap-distance-left:9pt;mso-wrap-distance-top:0;mso-wrap-distance-right:9pt;mso-wrap-distance-bottom:0;mso-position-horizontal:absolute;mso-position-horizontal-relative:text;mso-position-vertical:absolute;mso-position-vertical-relative:text;mso-width-percent:0;mso-height-percent:0;mso-width-relative:margin;mso-height-relative:margin;v-text-anchor:middle" o:gfxdata="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" filled="f" strokecolor="black [3213]" strokeweight="1pt"/>
+                    <v:rect w14:anchorId="7500713B" id="Rectangle 1" o:spid="_x0000_s1026" style="position:absolute;margin-left:-2.6pt;margin-top:11.8pt;width:16.35pt;height:8.7pt;z-index:251660288;visibility:visible;mso-wrap-style:square;mso-width-percent:0;mso-height-percent:0;mso-wrap-distance-left:9pt;mso-wrap-distance-top:0;mso-wrap-distance-right:9pt;mso-wrap-distance-bottom:0;mso-position-horizontal:absolute;mso-position-horizontal-relative:text;mso-position-vertical:absolute;mso-position-vertical-relative:text;mso-width-percent:0;mso-height-percent:0;mso-width-relative:margin;mso-height-relative:margin;v-text-anchor:middle" o:gfxdata="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" filled="f" strokecolor="black [3213]" strokeweight="1pt"/>
                   </w:pict>
                 </mc:Fallback>
               </mc:AlternateContent>
@@ -2863,7 +2863,7 @@
                 </mc:Choice>
                 <mc:Fallback>
                   <w:pict>
-                    <v:rect w14:anchorId="47D86FF8" id="Rectangle 44" o:spid="_x0000_s1026" style="position:absolute;margin-left:-2.5pt;margin-top:12.15pt;width:16.35pt;height:8.7pt;z-index:251658240;visibility:visible;mso-wrap-style:square;mso-width-percent:0;mso-height-percent:0;mso-wrap-distance-left:9pt;mso-wrap-distance-top:0;mso-wrap-distance-right:9pt;mso-wrap-distance-bottom:0;mso-position-horizontal:absolute;mso-position-horizontal-relative:text;mso-position-vertical:absolute;mso-position-vertical-relative:text;mso-width-percent:0;mso-height-percent:0;mso-width-relative:margin;mso-height-relative:margin;v-text-anchor:middle" o:gfxdata="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" filled="f" strokecolor="black [3213]" strokeweight="1pt"/>
+                    <v:rect w14:anchorId="6056D44C" id="Rectangle 44" o:spid="_x0000_s1026" style="position:absolute;margin-left:-2.5pt;margin-top:12.15pt;width:16.35pt;height:8.7pt;z-index:251658240;visibility:visible;mso-wrap-style:square;mso-width-percent:0;mso-height-percent:0;mso-wrap-distance-left:9pt;mso-wrap-distance-top:0;mso-wrap-distance-right:9pt;mso-wrap-distance-bottom:0;mso-position-horizontal:absolute;mso-position-horizontal-relative:text;mso-position-vertical:absolute;mso-position-vertical-relative:text;mso-width-percent:0;mso-height-percent:0;mso-width-relative:margin;mso-height-relative:margin;v-text-anchor:middle" o:gfxdata="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" filled="f" strokecolor="black [3213]" strokeweight="1pt"/>
                   </w:pict>
                 </mc:Fallback>
               </mc:AlternateContent>
@@ -3906,7 +3906,7 @@
                 </mc:Choice>
                 <mc:Fallback>
                   <w:pict>
-                    <v:rect w14:anchorId="2F2CE66C" id="Rectangle 5" o:spid="_x0000_s1026" style="position:absolute;margin-left:.2pt;margin-top:.85pt;width:16.35pt;height:8.7pt;z-index:251662336;visibility:visible;mso-wrap-style:square;mso-width-percent:0;mso-height-percent:0;mso-wrap-distance-left:9pt;mso-wrap-distance-top:0;mso-wrap-distance-right:9pt;mso-wrap-distance-bottom:0;mso-position-horizontal:absolute;mso-position-horizontal-relative:text;mso-position-vertical:absolute;mso-position-vertical-relative:text;mso-width-percent:0;mso-height-percent:0;mso-width-relative:margin;mso-height-relative:margin;v-text-anchor:middle" o:gfxdata="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" filled="f" strokecolor="black [3213]" strokeweight="1pt"/>
+                    <v:rect w14:anchorId="10055E38" id="Rectangle 5" o:spid="_x0000_s1026" style="position:absolute;margin-left:.2pt;margin-top:.85pt;width:16.35pt;height:8.7pt;z-index:251662336;visibility:visible;mso-wrap-style:square;mso-width-percent:0;mso-height-percent:0;mso-wrap-distance-left:9pt;mso-wrap-distance-top:0;mso-wrap-distance-right:9pt;mso-wrap-distance-bottom:0;mso-position-horizontal:absolute;mso-position-horizontal-relative:text;mso-position-vertical:absolute;mso-position-vertical-relative:text;mso-width-percent:0;mso-height-percent:0;mso-width-relative:margin;mso-height-relative:margin;v-text-anchor:middle" o:gfxdata="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" filled="f" strokecolor="black [3213]" strokeweight="1pt"/>
                   </w:pict>
                 </mc:Fallback>
               </mc:AlternateContent>
@@ -3990,7 +3990,7 @@
                 </mc:Choice>
                 <mc:Fallback>
                   <w:pict>
-                    <v:rect w14:anchorId="1C399F11" id="Rectangle 6" o:spid="_x0000_s1026" style="position:absolute;margin-left:-.05pt;margin-top:17.25pt;width:16.35pt;height:8.7pt;z-index:251663360;visibility:visible;mso-wrap-style:square;mso-width-percent:0;mso-height-percent:0;mso-wrap-distance-left:9pt;mso-wrap-distance-top:0;mso-wrap-distance-right:9pt;mso-wrap-distance-bottom:0;mso-position-horizontal:absolute;mso-position-horizontal-relative:text;mso-position-vertical:absolute;mso-position-vertical-relative:text;mso-width-percent:0;mso-height-percent:0;mso-width-relative:margin;mso-height-relative:margin;v-text-anchor:middle" o:gfxdata="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" filled="f" strokecolor="black [3213]" strokeweight="1pt"/>
+                    <v:rect w14:anchorId="6C7F49C3" id="Rectangle 6" o:spid="_x0000_s1026" style="position:absolute;margin-left:-.05pt;margin-top:17.25pt;width:16.35pt;height:8.7pt;z-index:251663360;visibility:visible;mso-wrap-style:square;mso-width-percent:0;mso-height-percent:0;mso-wrap-distance-left:9pt;mso-wrap-distance-top:0;mso-wrap-distance-right:9pt;mso-wrap-distance-bottom:0;mso-position-horizontal:absolute;mso-position-horizontal-relative:text;mso-position-vertical:absolute;mso-position-vertical-relative:text;mso-width-percent:0;mso-height-percent:0;mso-width-relative:margin;mso-height-relative:margin;v-text-anchor:middle" o:gfxdata="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" filled="f" strokecolor="black [3213]" strokeweight="1pt"/>
                   </w:pict>
                 </mc:Fallback>
               </mc:AlternateContent>
@@ -4087,47 +4087,31 @@
             <w:r>
               <w:rPr>
                 <w:rFonts w:ascii="Arial Narrow" w:hAnsi="Arial Narrow"/>
-                <w:color w:val="AEAAAA" w:themeColor="background2" w:themeShade="BF"/>
+                <w:color w:val="000000" w:themeColor="text1"/>
                 <w:sz w:val="26"/>
                 <w:szCs w:val="26"/>
               </w:rPr>
-              <w:t>_</w:t>
-            </w:r>
-            <w:r>
-              <w:rPr>
-                <w:rFonts w:ascii="Arial Narrow" w:hAnsi="Arial Narrow"/>
-                <w:color w:val="AEAAAA" w:themeColor="background2" w:themeShade="BF"/>
+              <w:t>{</w:t>
+            </w:r>
+            <w:proofErr w:type="spellStart"/>
+            <w:r>
+              <w:rPr>
+                <w:rFonts w:ascii="Arial Narrow" w:hAnsi="Arial Narrow"/>
+                <w:color w:val="000000" w:themeColor="text1"/>
                 <w:sz w:val="26"/>
                 <w:szCs w:val="26"/>
               </w:rPr>
-              <w:t>{Job_particulars}</w:t>
-            </w:r>
-            <w:r>
-              <w:rPr>
-                <w:rFonts w:ascii="Arial Narrow" w:hAnsi="Arial Narrow"/>
-                <w:color w:val="AEAAAA" w:themeColor="background2" w:themeShade="BF"/>
+              <w:t>Job_particulars</w:t>
+            </w:r>
+            <w:proofErr w:type="spellEnd"/>
+            <w:r>
+              <w:rPr>
+                <w:rFonts w:ascii="Arial Narrow" w:hAnsi="Arial Narrow"/>
+                <w:color w:val="000000" w:themeColor="text1"/>
                 <w:sz w:val="26"/>
                 <w:szCs w:val="26"/>
               </w:rPr>
-              <w:t>_________________________________________________________________________________________________________________________________________________________________________________________________________________________________________________________________________________________________________________________________________________________________________________________________________________________________________________________________________________________________________________________________________________________________________________________________________</w:t>
-            </w:r>
-            <w:r>
-              <w:rPr>
-                <w:rFonts w:ascii="Arial Narrow" w:hAnsi="Arial Narrow"/>
-                <w:color w:val="AEAAAA" w:themeColor="background2" w:themeShade="BF"/>
-                <w:sz w:val="26"/>
-                <w:szCs w:val="26"/>
-              </w:rPr>
-              <w:t>________________</w:t>
-            </w:r>
-            <w:r>
-              <w:rPr>
-                <w:rFonts w:ascii="Arial Narrow" w:hAnsi="Arial Narrow"/>
-                <w:color w:val="AEAAAA" w:themeColor="background2" w:themeShade="BF"/>
-                <w:sz w:val="26"/>
-                <w:szCs w:val="26"/>
-              </w:rPr>
-              <w:t>______________</w:t>
+              <w:t>}</w:t>
             </w:r>
           </w:p>
           <w:p>

</xml_diff>